<commit_message>
Update AWS machine learning courseware
</commit_message>
<xml_diff>
--- a/courseware/LP-AWS Certified Machine Learning Engineer Associate Training.docx
+++ b/courseware/LP-AWS Certified Machine Learning Engineer Associate Training.docx
@@ -188,7 +188,7 @@
           <w:color w:val="4B5563"/>
           <w:sz w:val="20"/>
         </w:rPr>
-        <w:t>Version 1</w:t>
+        <w:t>Version 2</w:t>
       </w:r>
     </w:p>
     <w:p>
@@ -288,7 +288,7 @@
           </w:tcPr>
           <w:p>
             <w:r>
-              <w:t>1</w:t>
+              <w:t>2</w:t>
             </w:r>
           </w:p>
         </w:tc>
@@ -298,7 +298,7 @@
           </w:tcPr>
           <w:p>
             <w:r>
-              <w:t>8 July 2026</w:t>
+              <w:t>13 July 2026</w:t>
             </w:r>
           </w:p>
         </w:tc>
@@ -308,7 +308,7 @@
           </w:tcPr>
           <w:p>
             <w:r>
-              <w:t>First AWS AWS MLA-C01 courseware build aligned to all 16 hands-on labs.</w:t>
+              <w:t>AWS MLA-C01 courseware aligned to all 8 hands-on labs and final assessment references.</w:t>
             </w:r>
           </w:p>
         </w:tc>
@@ -325,6 +325,61 @@
       </w:tr>
     </w:tbl>
     <w:p/>
+    <w:p>
+      <w:r>
+        <w:rPr>
+          <w:b/>
+          <w:color w:val="111827"/>
+          <w:sz w:val="28"/>
+        </w:rPr>
+        <w:t>Table of Contents</w:t>
+      </w:r>
+    </w:p>
+    <w:p>
+      <w:pPr>
+        <w:pStyle w:val="ListBullet"/>
+      </w:pPr>
+      <w:r>
+        <w:t>Course Information</w:t>
+      </w:r>
+    </w:p>
+    <w:p>
+      <w:pPr>
+        <w:pStyle w:val="ListBullet"/>
+      </w:pPr>
+      <w:r>
+        <w:t>Learning Outcomes</w:t>
+      </w:r>
+    </w:p>
+    <w:p>
+      <w:pPr>
+        <w:pStyle w:val="ListBullet"/>
+      </w:pPr>
+      <w:r>
+        <w:t>Course Outline</w:t>
+      </w:r>
+    </w:p>
+    <w:p>
+      <w:pPr>
+        <w:pStyle w:val="ListBullet"/>
+      </w:pPr>
+      <w:r>
+        <w:t>Hands-On Lab Guide / Detailed Lesson Plan</w:t>
+      </w:r>
+    </w:p>
+    <w:p>
+      <w:pPr>
+        <w:pStyle w:val="ListBullet"/>
+      </w:pPr>
+      <w:r>
+        <w:t>Assessment and Course Close</w:t>
+      </w:r>
+    </w:p>
+    <w:p>
+      <w:r>
+        <w:br w:type="page"/>
+      </w:r>
+    </w:p>
     <w:p>
       <w:pPr>
         <w:pStyle w:val="Heading1"/>
@@ -573,7 +628,7 @@
           </w:tcPr>
           <w:p>
             <w:r>
-              <w:t>AWS Certified Machine Learning Engineer Associate Training-v1.pptx</w:t>
+              <w:t>AWS Certified Machine Learning Engineer Associate Training-v2.pptx</w:t>
             </w:r>
           </w:p>
         </w:tc>
@@ -848,7 +903,7 @@
           </w:tcPr>
           <w:p>
             <w:r>
-              <w:t>1-13</w:t>
+              <w:t>1-16</w:t>
             </w:r>
           </w:p>
         </w:tc>
@@ -894,7 +949,7 @@
           </w:tcPr>
           <w:p>
             <w:r>
-              <w:t>21-23</w:t>
+              <w:t>26-28</w:t>
             </w:r>
           </w:p>
         </w:tc>
@@ -986,7 +1041,7 @@
           </w:tcPr>
           <w:p>
             <w:r>
-              <w:t>24-26</w:t>
+              <w:t>29-31</w:t>
             </w:r>
           </w:p>
         </w:tc>
@@ -1032,7 +1087,7 @@
           </w:tcPr>
           <w:p>
             <w:r>
-              <w:t>21-26</w:t>
+              <w:t>26-31</w:t>
             </w:r>
           </w:p>
         </w:tc>
@@ -1078,7 +1133,7 @@
           </w:tcPr>
           <w:p>
             <w:r>
-              <w:t>27-29</w:t>
+              <w:t>32-34</w:t>
             </w:r>
           </w:p>
         </w:tc>
@@ -1170,7 +1225,7 @@
           </w:tcPr>
           <w:p>
             <w:r>
-              <w:t>30-32</w:t>
+              <w:t>35-37</w:t>
             </w:r>
           </w:p>
         </w:tc>
@@ -1216,7 +1271,7 @@
           </w:tcPr>
           <w:p>
             <w:r>
-              <w:t>27-32</w:t>
+              <w:t>32-37</w:t>
             </w:r>
           </w:p>
         </w:tc>
@@ -1346,7 +1401,7 @@
           </w:tcPr>
           <w:p>
             <w:r>
-              <w:t>33-35</w:t>
+              <w:t>38-40</w:t>
             </w:r>
           </w:p>
         </w:tc>
@@ -1438,7 +1493,7 @@
           </w:tcPr>
           <w:p>
             <w:r>
-              <w:t>36-38</w:t>
+              <w:t>41-43</w:t>
             </w:r>
           </w:p>
         </w:tc>
@@ -1484,7 +1539,7 @@
           </w:tcPr>
           <w:p>
             <w:r>
-              <w:t>33-38</w:t>
+              <w:t>38-43</w:t>
             </w:r>
           </w:p>
         </w:tc>
@@ -1530,7 +1585,7 @@
           </w:tcPr>
           <w:p>
             <w:r>
-              <w:t>39-41</w:t>
+              <w:t>44-46</w:t>
             </w:r>
           </w:p>
         </w:tc>
@@ -1622,7 +1677,7 @@
           </w:tcPr>
           <w:p>
             <w:r>
-              <w:t>42-44</w:t>
+              <w:t>47-49</w:t>
             </w:r>
           </w:p>
         </w:tc>
@@ -1668,7 +1723,7 @@
           </w:tcPr>
           <w:p>
             <w:r>
-              <w:t>44-45</w:t>
+              <w:t>49-53</w:t>
             </w:r>
           </w:p>
         </w:tc>
@@ -1909,6 +1964,7 @@
     </w:tbl>
     <w:p/>
     <w:sectPr>
+      <w:footerReference w:type="default" r:id="rId11"/>
       <w:pgSz w:w="12240" w:h="15840"/>
       <w:pgMar w:top="1152" w:right="1296" w:bottom="1152" w:left="1296" w:header="720" w:footer="720" w:gutter="0"/>
       <w:cols w:space="720"/>
@@ -1916,6 +1972,20 @@
     </w:sectPr>
   </w:body>
 </w:document>
+</file>
+
+<file path=word/footer1.xml><?xml version="1.0" encoding="utf-8"?>
+<w:ftr xmlns:m="http://schemas.openxmlformats.org/officeDocument/2006/math" xmlns:mc="http://schemas.openxmlformats.org/markup-compatibility/2006" xmlns:mo="http://schemas.microsoft.com/office/mac/office/2008/main" xmlns:mv="urn:schemas-microsoft-com:mac:vml" xmlns:o="urn:schemas-microsoft-com:office:office" xmlns:r="http://schemas.openxmlformats.org/officeDocument/2006/relationships" xmlns:v="urn:schemas-microsoft-com:vml" xmlns:w10="urn:schemas-microsoft-com:office:word" xmlns:w14="http://schemas.microsoft.com/office/word/2010/wordml" xmlns:w="http://schemas.openxmlformats.org/wordprocessingml/2006/main" xmlns:wne="http://schemas.microsoft.com/office/word/2006/wordml" xmlns:wp14="http://schemas.microsoft.com/office/word/2010/wordprocessingDrawing" xmlns:wp="http://schemas.openxmlformats.org/drawingml/2006/wordprocessingDrawing" xmlns:wpc="http://schemas.microsoft.com/office/word/2010/wordprocessingCanvas" xmlns:wpg="http://schemas.microsoft.com/office/word/2010/wordprocessingGroup" xmlns:wpi="http://schemas.microsoft.com/office/word/2010/wordprocessingInk" xmlns:wps="http://schemas.microsoft.com/office/word/2010/wordprocessingShape" mc:Ignorable="w14 wp14">
+  <w:p>
+    <w:pPr>
+      <w:pStyle w:val="Footer"/>
+      <w:jc w:val="center"/>
+    </w:pPr>
+    <w:r>
+      <w:t>© 2026 Tertiary Infotech Academy Pte Ltd  |  TGS-2024049340</w:t>
+    </w:r>
+  </w:p>
+</w:ftr>
 </file>
 
 <file path=word/numbering.xml><?xml version="1.0" encoding="utf-8"?>

</xml_diff>